<commit_message>
Update resume site 2026-09-26 20:46
</commit_message>
<xml_diff>
--- a/public/assets/lin-xiaoqing-data-analyst-resume.docx
+++ b/public/assets/lin-xiaoqing-data-analyst-resume.docx
@@ -2017,7 +2017,7 @@
                 <w:color w:val="21191B"/>
                 <w:sz w:val="18"/>
               </w:rPr>
-              <w:t>广东理工学院</w:t>
+              <w:t>广东外语外贸大学</w:t>
             </w:r>
           </w:p>
           <w:p>
@@ -2038,7 +2038,7 @@
                 <w:color w:val="554A4D"/>
                 <w:sz w:val="17"/>
               </w:rPr>
-              <w:t>机械设计与制造 · 专科</w:t>
+              <w:t>人力资源管理 · 本科</w:t>
             </w:r>
           </w:p>
           <w:p>

</xml_diff>